<commit_message>
Implemented REST API endpoints
</commit_message>
<xml_diff>
--- a/documentation/task-management-api-roadmap.docx
+++ b/documentation/task-management-api-roadmap.docx
@@ -46,16 +46,8 @@
         <w:rPr>
           <w:strike/>
         </w:rPr>
-        <w:t>Create GitHub repo: task-management-</w:t>
-      </w:r>
-      <w:proofErr w:type="spellStart"/>
-      <w:r>
-        <w:rPr>
-          <w:strike/>
-        </w:rPr>
-        <w:t>api</w:t>
-      </w:r>
-      <w:proofErr w:type="spellEnd"/>
+        <w:t>Create GitHub repo: task-management-api</w:t>
+      </w:r>
     </w:p>
     <w:p>
       <w:pPr>
@@ -67,22 +59,12 @@
           <w:strike/>
         </w:rPr>
       </w:pPr>
-      <w:proofErr w:type="gramStart"/>
-      <w:r>
-        <w:rPr>
-          <w:strike/>
-        </w:rPr>
-        <w:t>Add .</w:t>
-      </w:r>
-      <w:proofErr w:type="spellStart"/>
-      <w:r>
-        <w:rPr>
-          <w:strike/>
-        </w:rPr>
-        <w:t>gitignore</w:t>
-      </w:r>
-      <w:proofErr w:type="spellEnd"/>
-      <w:proofErr w:type="gramEnd"/>
+      <w:r>
+        <w:rPr>
+          <w:strike/>
+        </w:rPr>
+        <w:t>Add .gitignore</w:t>
+      </w:r>
     </w:p>
     <w:p>
       <w:pPr>
@@ -166,16 +148,8 @@
         <w:rPr>
           <w:strike/>
         </w:rPr>
-        <w:t xml:space="preserve">Open in </w:t>
-      </w:r>
-      <w:proofErr w:type="spellStart"/>
-      <w:r>
-        <w:rPr>
-          <w:strike/>
-        </w:rPr>
-        <w:t>VSCode</w:t>
-      </w:r>
-      <w:proofErr w:type="spellEnd"/>
+        <w:t>Open in VSCode</w:t>
+      </w:r>
     </w:p>
     <w:p>
       <w:pPr>
@@ -191,21 +165,7 @@
         <w:rPr>
           <w:strike/>
         </w:rPr>
-        <w:t xml:space="preserve">Install </w:t>
-      </w:r>
-      <w:proofErr w:type="spellStart"/>
-      <w:r>
-        <w:rPr>
-          <w:strike/>
-        </w:rPr>
-        <w:t>VSCode</w:t>
-      </w:r>
-      <w:proofErr w:type="spellEnd"/>
-      <w:r>
-        <w:rPr>
-          <w:strike/>
-        </w:rPr>
-        <w:t xml:space="preserve"> extensions (Extension Pack for Java, Spring Boot Extension Pack)</w:t>
+        <w:t>Install VSCode extensions (Extension Pack for Java, Spring Boot Extension Pack)</w:t>
       </w:r>
     </w:p>
     <w:p>
@@ -222,38 +182,8 @@
         <w:rPr>
           <w:strike/>
         </w:rPr>
-        <w:t xml:space="preserve">Verify it runs: </w:t>
-      </w:r>
-      <w:proofErr w:type="spellStart"/>
-      <w:r>
-        <w:rPr>
-          <w:strike/>
-        </w:rPr>
-        <w:t>mvn</w:t>
-      </w:r>
-      <w:proofErr w:type="spellEnd"/>
-      <w:r>
-        <w:rPr>
-          <w:strike/>
-        </w:rPr>
-        <w:t xml:space="preserve"> </w:t>
-      </w:r>
-      <w:proofErr w:type="spellStart"/>
-      <w:r>
-        <w:rPr>
-          <w:strike/>
-        </w:rPr>
-        <w:t>spring-</w:t>
-      </w:r>
-      <w:proofErr w:type="gramStart"/>
-      <w:r>
-        <w:rPr>
-          <w:strike/>
-        </w:rPr>
-        <w:t>boot:run</w:t>
-      </w:r>
-      <w:proofErr w:type="spellEnd"/>
-      <w:proofErr w:type="gramEnd"/>
+        <w:t>Verify it runs: mvn spring-boot:run</w:t>
+      </w:r>
     </w:p>
     <w:p>
       <w:pPr>
@@ -302,6 +232,13 @@
         </w:rPr>
         <w:t>Phase 1: Database Layer</w:t>
       </w:r>
+      <w:r>
+        <w:rPr>
+          <w:b/>
+          <w:bCs/>
+        </w:rPr>
+        <w:t xml:space="preserve"> (db layer setup using h2 database)</w:t>
+      </w:r>
     </w:p>
     <w:p>
       <w:pPr>
@@ -309,8 +246,14 @@
           <w:ilvl w:val="0"/>
           <w:numId w:val="2"/>
         </w:numPr>
-      </w:pPr>
-      <w:r>
+        <w:rPr>
+          <w:strike/>
+        </w:rPr>
+      </w:pPr>
+      <w:r>
+        <w:rPr>
+          <w:strike/>
+        </w:rPr>
         <w:t xml:space="preserve">Create Task entity (model/Task.java) </w:t>
       </w:r>
     </w:p>
@@ -320,23 +263,16 @@
           <w:ilvl w:val="1"/>
           <w:numId w:val="2"/>
         </w:numPr>
-      </w:pPr>
-      <w:r>
-        <w:t xml:space="preserve">Fields: id, title, description, status, </w:t>
-      </w:r>
-      <w:proofErr w:type="spellStart"/>
-      <w:r>
-        <w:t>createdAt</w:t>
-      </w:r>
-      <w:proofErr w:type="spellEnd"/>
-      <w:r>
-        <w:t xml:space="preserve">, </w:t>
-      </w:r>
-      <w:proofErr w:type="spellStart"/>
-      <w:r>
-        <w:t>updatedAt</w:t>
-      </w:r>
-      <w:proofErr w:type="spellEnd"/>
+        <w:rPr>
+          <w:strike/>
+        </w:rPr>
+      </w:pPr>
+      <w:r>
+        <w:rPr>
+          <w:strike/>
+        </w:rPr>
+        <w:t>Fields: id, title, description, status, createdAt, updatedAt</w:t>
+      </w:r>
     </w:p>
     <w:p>
       <w:pPr>
@@ -344,25 +280,15 @@
           <w:ilvl w:val="0"/>
           <w:numId w:val="2"/>
         </w:numPr>
-      </w:pPr>
-      <w:r>
-        <w:t xml:space="preserve">Create </w:t>
-      </w:r>
-      <w:proofErr w:type="spellStart"/>
-      <w:r>
-        <w:t>TaskStatus</w:t>
-      </w:r>
-      <w:proofErr w:type="spellEnd"/>
-      <w:r>
-        <w:t xml:space="preserve"> </w:t>
-      </w:r>
-      <w:proofErr w:type="spellStart"/>
-      <w:r>
-        <w:t>enum</w:t>
-      </w:r>
-      <w:proofErr w:type="spellEnd"/>
-      <w:r>
-        <w:t xml:space="preserve"> (TODO, IN_PROGRESS, DONE)</w:t>
+        <w:rPr>
+          <w:strike/>
+        </w:rPr>
+      </w:pPr>
+      <w:r>
+        <w:rPr>
+          <w:strike/>
+        </w:rPr>
+        <w:t>Create TaskStatus enum (TODO, IN_PROGRESS, DONE)</w:t>
       </w:r>
     </w:p>
     <w:p>
@@ -371,17 +297,15 @@
           <w:ilvl w:val="0"/>
           <w:numId w:val="2"/>
         </w:numPr>
-      </w:pPr>
-      <w:r>
-        <w:t xml:space="preserve">Create </w:t>
-      </w:r>
-      <w:proofErr w:type="spellStart"/>
-      <w:r>
-        <w:t>TaskRepository</w:t>
-      </w:r>
-      <w:proofErr w:type="spellEnd"/>
-      <w:r>
-        <w:t xml:space="preserve"> interface</w:t>
+        <w:rPr>
+          <w:strike/>
+        </w:rPr>
+      </w:pPr>
+      <w:r>
+        <w:rPr>
+          <w:strike/>
+        </w:rPr>
+        <w:t>Create TaskRepository interface</w:t>
       </w:r>
     </w:p>
     <w:p>
@@ -390,17 +314,16 @@
           <w:ilvl w:val="0"/>
           <w:numId w:val="2"/>
         </w:numPr>
-      </w:pPr>
-      <w:r>
-        <w:t xml:space="preserve">Configure H2 database in </w:t>
-      </w:r>
-      <w:proofErr w:type="spellStart"/>
-      <w:proofErr w:type="gramStart"/>
-      <w:r>
-        <w:t>application.properties</w:t>
-      </w:r>
-      <w:proofErr w:type="spellEnd"/>
-      <w:proofErr w:type="gramEnd"/>
+        <w:rPr>
+          <w:strike/>
+        </w:rPr>
+      </w:pPr>
+      <w:r>
+        <w:rPr>
+          <w:strike/>
+        </w:rPr>
+        <w:t>Configure H2 database in application.properties</w:t>
+      </w:r>
     </w:p>
     <w:p>
       <w:pPr>
@@ -408,8 +331,14 @@
           <w:ilvl w:val="0"/>
           <w:numId w:val="2"/>
         </w:numPr>
-      </w:pPr>
-      <w:r>
+        <w:rPr>
+          <w:strike/>
+        </w:rPr>
+      </w:pPr>
+      <w:r>
+        <w:rPr>
+          <w:strike/>
+        </w:rPr>
         <w:t>Test: Run app, check H2 console works</w:t>
       </w:r>
     </w:p>
@@ -419,8 +348,14 @@
           <w:ilvl w:val="0"/>
           <w:numId w:val="2"/>
         </w:numPr>
-      </w:pPr>
-      <w:r>
+        <w:rPr>
+          <w:strike/>
+        </w:rPr>
+      </w:pPr>
+      <w:r>
+        <w:rPr>
+          <w:strike/>
+        </w:rPr>
         <w:t>Commit: "Add Task entity and repository"</w:t>
       </w:r>
     </w:p>
@@ -432,378 +367,223 @@
         </w:rPr>
         <w:t>Phase 2: Service Layer</w:t>
       </w:r>
-    </w:p>
-    <w:p>
-      <w:pPr>
-        <w:numPr>
-          <w:ilvl w:val="0"/>
-          <w:numId w:val="3"/>
-        </w:numPr>
-      </w:pPr>
-      <w:r>
-        <w:t xml:space="preserve">Create </w:t>
-      </w:r>
-      <w:proofErr w:type="spellStart"/>
-      <w:r>
-        <w:t>TaskService</w:t>
-      </w:r>
-      <w:proofErr w:type="spellEnd"/>
-      <w:r>
-        <w:t xml:space="preserve"> class</w:t>
-      </w:r>
-    </w:p>
-    <w:p>
-      <w:pPr>
-        <w:numPr>
-          <w:ilvl w:val="0"/>
-          <w:numId w:val="3"/>
-        </w:numPr>
-      </w:pPr>
-      <w:r>
-        <w:t xml:space="preserve">Implement </w:t>
-      </w:r>
-      <w:proofErr w:type="spellStart"/>
-      <w:proofErr w:type="gramStart"/>
-      <w:r>
-        <w:t>createTask</w:t>
-      </w:r>
-      <w:proofErr w:type="spellEnd"/>
-      <w:r>
-        <w:t>(</w:t>
-      </w:r>
-      <w:proofErr w:type="gramEnd"/>
-      <w:r>
-        <w:t>) method</w:t>
-      </w:r>
-    </w:p>
-    <w:p>
-      <w:pPr>
-        <w:numPr>
-          <w:ilvl w:val="0"/>
-          <w:numId w:val="3"/>
-        </w:numPr>
-      </w:pPr>
-      <w:r>
-        <w:lastRenderedPageBreak/>
-        <w:t xml:space="preserve">Implement </w:t>
-      </w:r>
-      <w:proofErr w:type="spellStart"/>
-      <w:proofErr w:type="gramStart"/>
-      <w:r>
-        <w:t>getAllTasks</w:t>
-      </w:r>
-      <w:proofErr w:type="spellEnd"/>
-      <w:r>
-        <w:t>(</w:t>
-      </w:r>
-      <w:proofErr w:type="gramEnd"/>
-      <w:r>
-        <w:t>) method</w:t>
-      </w:r>
-    </w:p>
-    <w:p>
-      <w:pPr>
-        <w:numPr>
-          <w:ilvl w:val="0"/>
-          <w:numId w:val="3"/>
-        </w:numPr>
-      </w:pPr>
-      <w:r>
-        <w:t xml:space="preserve">Implement </w:t>
-      </w:r>
-      <w:proofErr w:type="spellStart"/>
-      <w:proofErr w:type="gramStart"/>
-      <w:r>
-        <w:t>getTaskById</w:t>
-      </w:r>
-      <w:proofErr w:type="spellEnd"/>
-      <w:r>
-        <w:t>(</w:t>
-      </w:r>
-      <w:proofErr w:type="gramEnd"/>
-      <w:r>
-        <w:t>) method</w:t>
-      </w:r>
-    </w:p>
-    <w:p>
-      <w:pPr>
-        <w:numPr>
-          <w:ilvl w:val="0"/>
-          <w:numId w:val="3"/>
-        </w:numPr>
-      </w:pPr>
-      <w:r>
-        <w:t xml:space="preserve">Implement </w:t>
-      </w:r>
-      <w:proofErr w:type="spellStart"/>
-      <w:proofErr w:type="gramStart"/>
-      <w:r>
-        <w:t>updateTask</w:t>
-      </w:r>
-      <w:proofErr w:type="spellEnd"/>
-      <w:r>
-        <w:t>(</w:t>
-      </w:r>
-      <w:proofErr w:type="gramEnd"/>
-      <w:r>
-        <w:t>) method</w:t>
-      </w:r>
-    </w:p>
-    <w:p>
-      <w:pPr>
-        <w:numPr>
-          <w:ilvl w:val="0"/>
-          <w:numId w:val="3"/>
-        </w:numPr>
-      </w:pPr>
-      <w:r>
-        <w:t xml:space="preserve">Implement </w:t>
-      </w:r>
-      <w:proofErr w:type="spellStart"/>
-      <w:proofErr w:type="gramStart"/>
-      <w:r>
-        <w:t>deleteTask</w:t>
-      </w:r>
-      <w:proofErr w:type="spellEnd"/>
-      <w:r>
-        <w:t>(</w:t>
-      </w:r>
-      <w:proofErr w:type="gramEnd"/>
-      <w:r>
-        <w:t>) method</w:t>
-      </w:r>
-    </w:p>
-    <w:p>
-      <w:pPr>
-        <w:numPr>
-          <w:ilvl w:val="0"/>
-          <w:numId w:val="3"/>
-        </w:numPr>
-      </w:pPr>
-      <w:r>
-        <w:t xml:space="preserve">Add business logic: </w:t>
-      </w:r>
-      <w:proofErr w:type="spellStart"/>
-      <w:proofErr w:type="gramStart"/>
-      <w:r>
-        <w:t>updateTaskStatus</w:t>
-      </w:r>
-      <w:proofErr w:type="spellEnd"/>
-      <w:r>
-        <w:t>(</w:t>
-      </w:r>
-      <w:proofErr w:type="gramEnd"/>
-      <w:r>
-        <w:t>) with validation</w:t>
-      </w:r>
-    </w:p>
-    <w:p>
-      <w:pPr>
-        <w:numPr>
-          <w:ilvl w:val="0"/>
-          <w:numId w:val="3"/>
-        </w:numPr>
-      </w:pPr>
-      <w:r>
-        <w:t xml:space="preserve">Commit: "Add </w:t>
-      </w:r>
-      <w:proofErr w:type="spellStart"/>
-      <w:r>
-        <w:t>TaskService</w:t>
-      </w:r>
-      <w:proofErr w:type="spellEnd"/>
-      <w:r>
-        <w:t xml:space="preserve"> with CRUD operations"</w:t>
-      </w:r>
-    </w:p>
-    <w:p>
       <w:r>
         <w:rPr>
           <w:b/>
           <w:bCs/>
         </w:rPr>
-        <w:t>Phase 3: Controller Layer (REST API)</w:t>
-      </w:r>
-    </w:p>
-    <w:p>
-      <w:pPr>
-        <w:numPr>
-          <w:ilvl w:val="0"/>
-          <w:numId w:val="4"/>
-        </w:numPr>
-      </w:pPr>
-      <w:r>
-        <w:t xml:space="preserve">Create </w:t>
-      </w:r>
-      <w:proofErr w:type="spellStart"/>
-      <w:r>
-        <w:t>TaskController</w:t>
-      </w:r>
-      <w:proofErr w:type="spellEnd"/>
-      <w:r>
-        <w:t xml:space="preserve"> class</w:t>
-      </w:r>
-    </w:p>
-    <w:p>
-      <w:pPr>
-        <w:numPr>
-          <w:ilvl w:val="0"/>
-          <w:numId w:val="4"/>
-        </w:numPr>
-      </w:pPr>
-      <w:r>
-        <w:t>POST /</w:t>
-      </w:r>
-      <w:proofErr w:type="spellStart"/>
-      <w:r>
-        <w:t>api</w:t>
-      </w:r>
-      <w:proofErr w:type="spellEnd"/>
-      <w:r>
-        <w:t>/tasks - Create task endpoint</w:t>
-      </w:r>
-    </w:p>
-    <w:p>
-      <w:pPr>
-        <w:numPr>
-          <w:ilvl w:val="0"/>
-          <w:numId w:val="4"/>
-        </w:numPr>
-      </w:pPr>
-      <w:r>
-        <w:t>GET /</w:t>
-      </w:r>
-      <w:proofErr w:type="spellStart"/>
-      <w:r>
-        <w:t>api</w:t>
-      </w:r>
-      <w:proofErr w:type="spellEnd"/>
-      <w:r>
-        <w:t>/tasks - Get all tasks endpoint</w:t>
-      </w:r>
-    </w:p>
-    <w:p>
-      <w:pPr>
-        <w:numPr>
-          <w:ilvl w:val="0"/>
-          <w:numId w:val="4"/>
-        </w:numPr>
-      </w:pPr>
-      <w:r>
-        <w:t>GET /</w:t>
-      </w:r>
-      <w:proofErr w:type="spellStart"/>
-      <w:r>
-        <w:t>api</w:t>
-      </w:r>
-      <w:proofErr w:type="spellEnd"/>
-      <w:r>
-        <w:t>/</w:t>
-      </w:r>
-      <w:proofErr w:type="gramStart"/>
-      <w:r>
-        <w:t>tasks/{id} -</w:t>
-      </w:r>
-      <w:proofErr w:type="gramEnd"/>
-      <w:r>
-        <w:t xml:space="preserve"> Get single task endpoint</w:t>
-      </w:r>
-    </w:p>
-    <w:p>
-      <w:pPr>
-        <w:numPr>
-          <w:ilvl w:val="0"/>
-          <w:numId w:val="4"/>
-        </w:numPr>
-      </w:pPr>
-      <w:r>
-        <w:t>PUT /</w:t>
-      </w:r>
-      <w:proofErr w:type="spellStart"/>
-      <w:r>
-        <w:t>api</w:t>
-      </w:r>
-      <w:proofErr w:type="spellEnd"/>
-      <w:r>
-        <w:t>/</w:t>
-      </w:r>
-      <w:proofErr w:type="gramStart"/>
-      <w:r>
-        <w:t>tasks/{id} -</w:t>
-      </w:r>
-      <w:proofErr w:type="gramEnd"/>
-      <w:r>
-        <w:t xml:space="preserve"> Update task endpoint</w:t>
-      </w:r>
-    </w:p>
-    <w:p>
-      <w:pPr>
-        <w:numPr>
-          <w:ilvl w:val="0"/>
-          <w:numId w:val="4"/>
-        </w:numPr>
-      </w:pPr>
-      <w:r>
-        <w:t>DELETE /</w:t>
-      </w:r>
-      <w:proofErr w:type="spellStart"/>
-      <w:r>
-        <w:t>api</w:t>
-      </w:r>
-      <w:proofErr w:type="spellEnd"/>
-      <w:r>
-        <w:t>/</w:t>
-      </w:r>
-      <w:proofErr w:type="gramStart"/>
-      <w:r>
-        <w:t>tasks/{id} -</w:t>
-      </w:r>
-      <w:proofErr w:type="gramEnd"/>
-      <w:r>
-        <w:t xml:space="preserve"> Delete task endpoint</w:t>
-      </w:r>
-    </w:p>
-    <w:p>
-      <w:pPr>
-        <w:numPr>
-          <w:ilvl w:val="0"/>
-          <w:numId w:val="4"/>
-        </w:numPr>
-      </w:pPr>
-      <w:r>
-        <w:t>PATCH /</w:t>
-      </w:r>
-      <w:proofErr w:type="spellStart"/>
-      <w:r>
-        <w:t>api</w:t>
-      </w:r>
-      <w:proofErr w:type="spellEnd"/>
-      <w:r>
-        <w:t>/</w:t>
-      </w:r>
-      <w:proofErr w:type="gramStart"/>
-      <w:r>
-        <w:t>tasks/{id}/</w:t>
-      </w:r>
-      <w:proofErr w:type="gramEnd"/>
-      <w:r>
-        <w:t>status - Update status endpoint</w:t>
-      </w:r>
-    </w:p>
-    <w:p>
-      <w:pPr>
-        <w:numPr>
-          <w:ilvl w:val="0"/>
-          <w:numId w:val="4"/>
-        </w:numPr>
-      </w:pPr>
-      <w:proofErr w:type="gramStart"/>
-      <w:r>
-        <w:t>Commit</w:t>
-      </w:r>
-      <w:proofErr w:type="gramEnd"/>
-      <w:r>
-        <w:t>: "Add REST API endpoints"</w:t>
+        <w:t xml:space="preserve"> (take advantage of the task repository in implementing service layer) </w:t>
+      </w:r>
+    </w:p>
+    <w:p>
+      <w:pPr>
+        <w:numPr>
+          <w:ilvl w:val="0"/>
+          <w:numId w:val="3"/>
+        </w:numPr>
+        <w:rPr>
+          <w:strike/>
+        </w:rPr>
+      </w:pPr>
+      <w:r>
+        <w:rPr>
+          <w:strike/>
+        </w:rPr>
+        <w:t>Create TaskService class</w:t>
+      </w:r>
+    </w:p>
+    <w:p>
+      <w:pPr>
+        <w:numPr>
+          <w:ilvl w:val="1"/>
+          <w:numId w:val="3"/>
+        </w:numPr>
+        <w:rPr>
+          <w:strike/>
+        </w:rPr>
+      </w:pPr>
+      <w:r>
+        <w:rPr>
+          <w:strike/>
+        </w:rPr>
+        <w:t xml:space="preserve">Contains your business logic </w:t>
+      </w:r>
+    </w:p>
+    <w:p>
+      <w:pPr>
+        <w:numPr>
+          <w:ilvl w:val="1"/>
+          <w:numId w:val="3"/>
+        </w:numPr>
+        <w:rPr>
+          <w:strike/>
+        </w:rPr>
+      </w:pPr>
+      <w:r>
+        <w:rPr>
+          <w:strike/>
+        </w:rPr>
+        <w:lastRenderedPageBreak/>
+        <w:t>Sits</w:t>
+      </w:r>
+      <w:r>
+        <w:rPr>
+          <w:strike/>
+        </w:rPr>
+        <w:t xml:space="preserve"> between Controller and Repository </w:t>
+      </w:r>
+    </w:p>
+    <w:p>
+      <w:pPr>
+        <w:numPr>
+          <w:ilvl w:val="1"/>
+          <w:numId w:val="3"/>
+        </w:numPr>
+        <w:rPr>
+          <w:strike/>
+        </w:rPr>
+      </w:pPr>
+      <w:r>
+        <w:rPr>
+          <w:strike/>
+        </w:rPr>
+        <w:t xml:space="preserve">Implements the CRUD operations </w:t>
+      </w:r>
+    </w:p>
+    <w:p>
+      <w:pPr>
+        <w:numPr>
+          <w:ilvl w:val="1"/>
+          <w:numId w:val="3"/>
+        </w:numPr>
+        <w:rPr>
+          <w:strike/>
+        </w:rPr>
+      </w:pPr>
+      <w:r>
+        <w:rPr>
+          <w:strike/>
+        </w:rPr>
+        <w:t>Adds validation and business rules</w:t>
+      </w:r>
+    </w:p>
+    <w:p>
+      <w:pPr>
+        <w:numPr>
+          <w:ilvl w:val="0"/>
+          <w:numId w:val="3"/>
+        </w:numPr>
+        <w:rPr>
+          <w:strike/>
+        </w:rPr>
+      </w:pPr>
+      <w:r>
+        <w:rPr>
+          <w:strike/>
+        </w:rPr>
+        <w:t>Implement createTask() method</w:t>
+      </w:r>
+    </w:p>
+    <w:p>
+      <w:pPr>
+        <w:numPr>
+          <w:ilvl w:val="0"/>
+          <w:numId w:val="3"/>
+        </w:numPr>
+        <w:rPr>
+          <w:strike/>
+        </w:rPr>
+      </w:pPr>
+      <w:r>
+        <w:rPr>
+          <w:strike/>
+        </w:rPr>
+        <w:t>Implement getAllTasks() method</w:t>
+      </w:r>
+    </w:p>
+    <w:p>
+      <w:pPr>
+        <w:numPr>
+          <w:ilvl w:val="0"/>
+          <w:numId w:val="3"/>
+        </w:numPr>
+        <w:rPr>
+          <w:strike/>
+        </w:rPr>
+      </w:pPr>
+      <w:r>
+        <w:rPr>
+          <w:strike/>
+        </w:rPr>
+        <w:t>Implement getTaskById() method</w:t>
+      </w:r>
+    </w:p>
+    <w:p>
+      <w:pPr>
+        <w:numPr>
+          <w:ilvl w:val="0"/>
+          <w:numId w:val="3"/>
+        </w:numPr>
+        <w:rPr>
+          <w:strike/>
+        </w:rPr>
+      </w:pPr>
+      <w:r>
+        <w:rPr>
+          <w:strike/>
+        </w:rPr>
+        <w:t>Implement updateTask() method</w:t>
+      </w:r>
+    </w:p>
+    <w:p>
+      <w:pPr>
+        <w:numPr>
+          <w:ilvl w:val="0"/>
+          <w:numId w:val="3"/>
+        </w:numPr>
+        <w:rPr>
+          <w:strike/>
+        </w:rPr>
+      </w:pPr>
+      <w:r>
+        <w:rPr>
+          <w:strike/>
+        </w:rPr>
+        <w:t>Implement deleteTask() method</w:t>
+      </w:r>
+    </w:p>
+    <w:p>
+      <w:pPr>
+        <w:numPr>
+          <w:ilvl w:val="0"/>
+          <w:numId w:val="3"/>
+        </w:numPr>
+        <w:rPr>
+          <w:strike/>
+        </w:rPr>
+      </w:pPr>
+      <w:r>
+        <w:rPr>
+          <w:strike/>
+        </w:rPr>
+        <w:t>Add business logic: updateTaskStatus() with validation</w:t>
+      </w:r>
+    </w:p>
+    <w:p>
+      <w:pPr>
+        <w:numPr>
+          <w:ilvl w:val="0"/>
+          <w:numId w:val="3"/>
+        </w:numPr>
+        <w:rPr>
+          <w:strike/>
+        </w:rPr>
+      </w:pPr>
+      <w:r>
+        <w:rPr>
+          <w:strike/>
+        </w:rPr>
+        <w:t>Commit: "Add TaskService with CRUD operations"</w:t>
       </w:r>
     </w:p>
     <w:p>
@@ -812,99 +592,95 @@
           <w:b/>
           <w:bCs/>
         </w:rPr>
-        <w:t>Phase 4: Error Handling &amp; Validation</w:t>
-      </w:r>
-    </w:p>
-    <w:p>
-      <w:pPr>
-        <w:numPr>
-          <w:ilvl w:val="0"/>
-          <w:numId w:val="5"/>
-        </w:numPr>
-      </w:pPr>
-      <w:r>
-        <w:t>Create custom exceptions (</w:t>
-      </w:r>
-      <w:proofErr w:type="spellStart"/>
-      <w:r>
-        <w:t>ResourceNotFoundException</w:t>
-      </w:r>
-      <w:proofErr w:type="spellEnd"/>
-      <w:r>
-        <w:t>, etc.)</w:t>
-      </w:r>
-    </w:p>
-    <w:p>
-      <w:pPr>
-        <w:numPr>
-          <w:ilvl w:val="0"/>
-          <w:numId w:val="5"/>
-        </w:numPr>
-      </w:pPr>
-      <w:r>
-        <w:t xml:space="preserve">Create </w:t>
-      </w:r>
-      <w:proofErr w:type="spellStart"/>
-      <w:r>
-        <w:t>GlobalExceptionHandler</w:t>
-      </w:r>
-      <w:proofErr w:type="spellEnd"/>
-    </w:p>
-    <w:p>
-      <w:pPr>
-        <w:numPr>
-          <w:ilvl w:val="0"/>
-          <w:numId w:val="5"/>
-        </w:numPr>
-      </w:pPr>
-      <w:proofErr w:type="gramStart"/>
-      <w:r>
-        <w:t>Add @</w:t>
-      </w:r>
-      <w:proofErr w:type="gramEnd"/>
-      <w:r>
-        <w:t>Valid annotations to endpoints</w:t>
-      </w:r>
-    </w:p>
-    <w:p>
-      <w:pPr>
-        <w:numPr>
-          <w:ilvl w:val="0"/>
-          <w:numId w:val="5"/>
-        </w:numPr>
-      </w:pPr>
-      <w:r>
-        <w:t xml:space="preserve">Add validation to Task </w:t>
-      </w:r>
-      <w:proofErr w:type="gramStart"/>
-      <w:r>
-        <w:t>entity (@</w:t>
-      </w:r>
-      <w:proofErr w:type="gramEnd"/>
-      <w:r>
-        <w:t>NotBlank, etc.)</w:t>
-      </w:r>
-    </w:p>
-    <w:p>
-      <w:pPr>
-        <w:numPr>
-          <w:ilvl w:val="0"/>
-          <w:numId w:val="5"/>
-        </w:numPr>
-      </w:pPr>
-      <w:r>
-        <w:t>Test error cases with Postman</w:t>
-      </w:r>
-    </w:p>
-    <w:p>
-      <w:pPr>
-        <w:numPr>
-          <w:ilvl w:val="0"/>
-          <w:numId w:val="5"/>
-        </w:numPr>
-      </w:pPr>
-      <w:r>
-        <w:t>Commit: "Add error handling and validation"</w:t>
+        <w:t>Phase 3: Controller Layer (REST API)</w:t>
+      </w:r>
+    </w:p>
+    <w:p>
+      <w:pPr>
+        <w:numPr>
+          <w:ilvl w:val="0"/>
+          <w:numId w:val="4"/>
+        </w:numPr>
+      </w:pPr>
+      <w:r>
+        <w:t>Create TaskController class</w:t>
+      </w:r>
+    </w:p>
+    <w:p>
+      <w:pPr>
+        <w:numPr>
+          <w:ilvl w:val="0"/>
+          <w:numId w:val="4"/>
+        </w:numPr>
+      </w:pPr>
+      <w:r>
+        <w:t>POST /api/tasks - Create task endpoint</w:t>
+      </w:r>
+    </w:p>
+    <w:p>
+      <w:pPr>
+        <w:numPr>
+          <w:ilvl w:val="0"/>
+          <w:numId w:val="4"/>
+        </w:numPr>
+      </w:pPr>
+      <w:r>
+        <w:t>GET /api/tasks - Get all tasks endpoint</w:t>
+      </w:r>
+    </w:p>
+    <w:p>
+      <w:pPr>
+        <w:numPr>
+          <w:ilvl w:val="0"/>
+          <w:numId w:val="4"/>
+        </w:numPr>
+      </w:pPr>
+      <w:r>
+        <w:t>GET /api/tasks/{id} - Get single task endpoint</w:t>
+      </w:r>
+    </w:p>
+    <w:p>
+      <w:pPr>
+        <w:numPr>
+          <w:ilvl w:val="0"/>
+          <w:numId w:val="4"/>
+        </w:numPr>
+      </w:pPr>
+      <w:r>
+        <w:t>PUT /api/tasks/{id} - Update task endpoint</w:t>
+      </w:r>
+    </w:p>
+    <w:p>
+      <w:pPr>
+        <w:numPr>
+          <w:ilvl w:val="0"/>
+          <w:numId w:val="4"/>
+        </w:numPr>
+      </w:pPr>
+      <w:r>
+        <w:t>DELETE /api/tasks/{id} - Delete task endpoint</w:t>
+      </w:r>
+    </w:p>
+    <w:p>
+      <w:pPr>
+        <w:numPr>
+          <w:ilvl w:val="0"/>
+          <w:numId w:val="4"/>
+        </w:numPr>
+      </w:pPr>
+      <w:r>
+        <w:t>PATCH /api/tasks/{id}/status - Update status endpoint</w:t>
+      </w:r>
+    </w:p>
+    <w:p>
+      <w:pPr>
+        <w:numPr>
+          <w:ilvl w:val="0"/>
+          <w:numId w:val="4"/>
+        </w:numPr>
+      </w:pPr>
+      <w:r>
+        <w:t>Commit: "Add REST API endpoints"</w:t>
       </w:r>
     </w:p>
     <w:p>
@@ -913,6 +689,82 @@
           <w:b/>
           <w:bCs/>
         </w:rPr>
+        <w:t>Phase 4: Error Handling &amp; Validation</w:t>
+      </w:r>
+    </w:p>
+    <w:p>
+      <w:pPr>
+        <w:numPr>
+          <w:ilvl w:val="0"/>
+          <w:numId w:val="5"/>
+        </w:numPr>
+      </w:pPr>
+      <w:r>
+        <w:t>Create custom exceptions (ResourceNotFoundException, etc.)</w:t>
+      </w:r>
+    </w:p>
+    <w:p>
+      <w:pPr>
+        <w:numPr>
+          <w:ilvl w:val="0"/>
+          <w:numId w:val="5"/>
+        </w:numPr>
+      </w:pPr>
+      <w:r>
+        <w:t>Create GlobalExceptionHandler</w:t>
+      </w:r>
+    </w:p>
+    <w:p>
+      <w:pPr>
+        <w:numPr>
+          <w:ilvl w:val="0"/>
+          <w:numId w:val="5"/>
+        </w:numPr>
+      </w:pPr>
+      <w:r>
+        <w:t>Add @Valid annotations to endpoints</w:t>
+      </w:r>
+    </w:p>
+    <w:p>
+      <w:pPr>
+        <w:numPr>
+          <w:ilvl w:val="0"/>
+          <w:numId w:val="5"/>
+        </w:numPr>
+      </w:pPr>
+      <w:r>
+        <w:t>Add validation to Task entity (@NotBlank, etc.)</w:t>
+      </w:r>
+    </w:p>
+    <w:p>
+      <w:pPr>
+        <w:numPr>
+          <w:ilvl w:val="0"/>
+          <w:numId w:val="5"/>
+        </w:numPr>
+      </w:pPr>
+      <w:r>
+        <w:t>Test error cases with Postman</w:t>
+      </w:r>
+    </w:p>
+    <w:p>
+      <w:pPr>
+        <w:numPr>
+          <w:ilvl w:val="0"/>
+          <w:numId w:val="5"/>
+        </w:numPr>
+      </w:pPr>
+      <w:r>
+        <w:t>Commit: "Add error handling and validation"</w:t>
+      </w:r>
+    </w:p>
+    <w:p>
+      <w:r>
+        <w:rPr>
+          <w:b/>
+          <w:bCs/>
+        </w:rPr>
+        <w:lastRenderedPageBreak/>
         <w:t>Phase 5: Local Testing</w:t>
       </w:r>
     </w:p>
@@ -957,7 +809,6 @@
         </w:numPr>
       </w:pPr>
       <w:r>
-        <w:lastRenderedPageBreak/>
         <w:t>Test status transitions</w:t>
       </w:r>
     </w:p>
@@ -1035,15 +886,7 @@
         </w:numPr>
       </w:pPr>
       <w:r>
-        <w:t xml:space="preserve">Create </w:t>
-      </w:r>
-      <w:proofErr w:type="spellStart"/>
-      <w:r>
-        <w:t>Dockerfile</w:t>
-      </w:r>
-      <w:proofErr w:type="spellEnd"/>
-      <w:r>
-        <w:t xml:space="preserve"> (multi-stage build)</w:t>
+        <w:t>Create Dockerfile (multi-stage build)</w:t>
       </w:r>
     </w:p>
     <w:p>
@@ -1054,15 +897,7 @@
         </w:numPr>
       </w:pPr>
       <w:r>
-        <w:t>Create docker-</w:t>
-      </w:r>
-      <w:proofErr w:type="spellStart"/>
-      <w:r>
-        <w:t>compose.yml</w:t>
-      </w:r>
-      <w:proofErr w:type="spellEnd"/>
-      <w:r>
-        <w:t xml:space="preserve"> (app + MySQL)</w:t>
+        <w:t>Create docker-compose.yml (app + MySQL)</w:t>
       </w:r>
     </w:p>
     <w:p>
@@ -1073,17 +908,7 @@
         </w:numPr>
       </w:pPr>
       <w:r>
-        <w:t xml:space="preserve">Update </w:t>
-      </w:r>
-      <w:proofErr w:type="spellStart"/>
-      <w:proofErr w:type="gramStart"/>
-      <w:r>
-        <w:t>application.properties</w:t>
-      </w:r>
-      <w:proofErr w:type="spellEnd"/>
-      <w:proofErr w:type="gramEnd"/>
-      <w:r>
-        <w:t xml:space="preserve"> for MySQL</w:t>
+        <w:t>Update application.properties for MySQL</w:t>
       </w:r>
     </w:p>
     <w:p>
@@ -1233,6 +1058,7 @@
           <w:b/>
           <w:bCs/>
         </w:rPr>
+        <w:lastRenderedPageBreak/>
         <w:t>Phase 8: CI/CD Pipeline</w:t>
       </w:r>
     </w:p>
@@ -1244,21 +1070,8 @@
         </w:numPr>
       </w:pPr>
       <w:r>
-        <w:t>Create .</w:t>
-      </w:r>
-      <w:proofErr w:type="spellStart"/>
-      <w:r>
-        <w:t>github</w:t>
-      </w:r>
-      <w:proofErr w:type="spellEnd"/>
-      <w:r>
-        <w:t>/workflows/</w:t>
-      </w:r>
-      <w:proofErr w:type="spellStart"/>
-      <w:r>
-        <w:t>deploy.yml</w:t>
-      </w:r>
-      <w:proofErr w:type="spellEnd"/>
+        <w:t>Create .github/workflows/deploy.yml</w:t>
+      </w:r>
     </w:p>
     <w:p>
       <w:pPr>
@@ -1290,7 +1103,6 @@
         </w:numPr>
       </w:pPr>
       <w:r>
-        <w:lastRenderedPageBreak/>
         <w:t>Add Docker build step</w:t>
       </w:r>
     </w:p>
@@ -1522,15 +1334,7 @@
         </w:numPr>
       </w:pPr>
       <w:r>
-        <w:t xml:space="preserve">Add architecture diagram (draw.io or </w:t>
-      </w:r>
-      <w:proofErr w:type="spellStart"/>
-      <w:r>
-        <w:t>Excalidraw</w:t>
-      </w:r>
-      <w:proofErr w:type="spellEnd"/>
-      <w:r>
-        <w:t>)</w:t>
+        <w:t>Add architecture diagram (draw.io or Excalidraw)</w:t>
       </w:r>
     </w:p>
     <w:p>
@@ -1552,6 +1356,7 @@
         </w:numPr>
       </w:pPr>
       <w:r>
+        <w:lastRenderedPageBreak/>
         <w:t>Add API documentation section</w:t>
       </w:r>
     </w:p>
@@ -1562,13 +1367,8 @@
           <w:numId w:val="11"/>
         </w:numPr>
       </w:pPr>
-      <w:proofErr w:type="gramStart"/>
-      <w:r>
-        <w:t>Commit</w:t>
-      </w:r>
-      <w:proofErr w:type="gramEnd"/>
-      <w:r>
-        <w:t>: "Add documentation"</w:t>
+      <w:r>
+        <w:t>Commit: "Add documentation"</w:t>
       </w:r>
     </w:p>
     <w:p>
@@ -1601,16 +1401,7 @@
         </w:numPr>
       </w:pPr>
       <w:r>
-        <w:lastRenderedPageBreak/>
-        <w:t xml:space="preserve">All </w:t>
-      </w:r>
-      <w:proofErr w:type="gramStart"/>
-      <w:r>
-        <w:t>code</w:t>
-      </w:r>
-      <w:proofErr w:type="gramEnd"/>
-      <w:r>
-        <w:t xml:space="preserve"> pushed to GitHub</w:t>
+        <w:t>All code pushed to GitHub</w:t>
       </w:r>
     </w:p>
     <w:p>
@@ -3042,7 +2833,7 @@
         <w:sz w:val="20"/>
       </w:rPr>
     </w:lvl>
-    <w:lvl w:ilvl="1" w:tentative="1">
+    <w:lvl w:ilvl="1">
       <w:start w:val="1"/>
       <w:numFmt w:val="bullet"/>
       <w:lvlText w:val="o"/>

</xml_diff>

<commit_message>
Fixed timestamps  null error
</commit_message>
<xml_diff>
--- a/documentation/task-management-api-roadmap.docx
+++ b/documentation/task-management-api-roadmap.docx
@@ -601,8 +601,14 @@
           <w:ilvl w:val="0"/>
           <w:numId w:val="4"/>
         </w:numPr>
-      </w:pPr>
-      <w:r>
+        <w:rPr>
+          <w:strike/>
+        </w:rPr>
+      </w:pPr>
+      <w:r>
+        <w:rPr>
+          <w:strike/>
+        </w:rPr>
         <w:t>Create TaskController class</w:t>
       </w:r>
     </w:p>
@@ -612,8 +618,14 @@
           <w:ilvl w:val="0"/>
           <w:numId w:val="4"/>
         </w:numPr>
-      </w:pPr>
-      <w:r>
+        <w:rPr>
+          <w:strike/>
+        </w:rPr>
+      </w:pPr>
+      <w:r>
+        <w:rPr>
+          <w:strike/>
+        </w:rPr>
         <w:t>POST /api/tasks - Create task endpoint</w:t>
       </w:r>
     </w:p>
@@ -623,8 +635,14 @@
           <w:ilvl w:val="0"/>
           <w:numId w:val="4"/>
         </w:numPr>
-      </w:pPr>
-      <w:r>
+        <w:rPr>
+          <w:strike/>
+        </w:rPr>
+      </w:pPr>
+      <w:r>
+        <w:rPr>
+          <w:strike/>
+        </w:rPr>
         <w:t>GET /api/tasks - Get all tasks endpoint</w:t>
       </w:r>
     </w:p>
@@ -634,8 +652,14 @@
           <w:ilvl w:val="0"/>
           <w:numId w:val="4"/>
         </w:numPr>
-      </w:pPr>
-      <w:r>
+        <w:rPr>
+          <w:strike/>
+        </w:rPr>
+      </w:pPr>
+      <w:r>
+        <w:rPr>
+          <w:strike/>
+        </w:rPr>
         <w:t>GET /api/tasks/{id} - Get single task endpoint</w:t>
       </w:r>
     </w:p>
@@ -645,8 +669,14 @@
           <w:ilvl w:val="0"/>
           <w:numId w:val="4"/>
         </w:numPr>
-      </w:pPr>
-      <w:r>
+        <w:rPr>
+          <w:strike/>
+        </w:rPr>
+      </w:pPr>
+      <w:r>
+        <w:rPr>
+          <w:strike/>
+        </w:rPr>
         <w:t>PUT /api/tasks/{id} - Update task endpoint</w:t>
       </w:r>
     </w:p>
@@ -656,8 +686,14 @@
           <w:ilvl w:val="0"/>
           <w:numId w:val="4"/>
         </w:numPr>
-      </w:pPr>
-      <w:r>
+        <w:rPr>
+          <w:strike/>
+        </w:rPr>
+      </w:pPr>
+      <w:r>
+        <w:rPr>
+          <w:strike/>
+        </w:rPr>
         <w:t>DELETE /api/tasks/{id} - Delete task endpoint</w:t>
       </w:r>
     </w:p>
@@ -667,8 +703,14 @@
           <w:ilvl w:val="0"/>
           <w:numId w:val="4"/>
         </w:numPr>
-      </w:pPr>
-      <w:r>
+        <w:rPr>
+          <w:strike/>
+        </w:rPr>
+      </w:pPr>
+      <w:r>
+        <w:rPr>
+          <w:strike/>
+        </w:rPr>
         <w:t>PATCH /api/tasks/{id}/status - Update status endpoint</w:t>
       </w:r>
     </w:p>
@@ -678,8 +720,14 @@
           <w:ilvl w:val="0"/>
           <w:numId w:val="4"/>
         </w:numPr>
-      </w:pPr>
-      <w:r>
+        <w:rPr>
+          <w:strike/>
+        </w:rPr>
+      </w:pPr>
+      <w:r>
+        <w:rPr>
+          <w:strike/>
+        </w:rPr>
         <w:t>Commit: "Add REST API endpoints"</w:t>
       </w:r>
     </w:p>
@@ -1457,6 +1505,36 @@
       </w:pPr>
       <w:r>
         <w:t>Prepare to explain it in interviews</w:t>
+      </w:r>
+    </w:p>
+    <w:p/>
+    <w:p>
+      <w:r>
+        <w:t>Tasks to work on</w:t>
+      </w:r>
+    </w:p>
+    <w:p>
+      <w:pPr>
+        <w:pStyle w:val="ListParagraph"/>
+        <w:numPr>
+          <w:ilvl w:val="0"/>
+          <w:numId w:val="13"/>
+        </w:numPr>
+      </w:pPr>
+      <w:r>
+        <w:t>Exceptions</w:t>
+      </w:r>
+    </w:p>
+    <w:p>
+      <w:pPr>
+        <w:pStyle w:val="ListParagraph"/>
+        <w:numPr>
+          <w:ilvl w:val="0"/>
+          <w:numId w:val="13"/>
+        </w:numPr>
+      </w:pPr>
+      <w:r>
+        <w:t>Connect to db using DBeaver</w:t>
       </w:r>
     </w:p>
     <w:p/>
@@ -2963,6 +3041,119 @@
     </w:lvl>
   </w:abstractNum>
   <w:abstractNum w:abstractNumId="10" w15:restartNumberingAfterBreak="0">
+    <w:nsid w:val="5C8D5725"/>
+    <w:multiLevelType w:val="hybridMultilevel"/>
+    <w:tmpl w:val="F65011B6"/>
+    <w:lvl w:ilvl="0" w:tplc="04090001">
+      <w:start w:val="1"/>
+      <w:numFmt w:val="bullet"/>
+      <w:lvlText w:val=""/>
+      <w:lvlJc w:val="left"/>
+      <w:pPr>
+        <w:ind w:left="720" w:hanging="360"/>
+      </w:pPr>
+      <w:rPr>
+        <w:rFonts w:ascii="Symbol" w:hAnsi="Symbol" w:hint="default"/>
+      </w:rPr>
+    </w:lvl>
+    <w:lvl w:ilvl="1" w:tplc="04090003" w:tentative="1">
+      <w:start w:val="1"/>
+      <w:numFmt w:val="bullet"/>
+      <w:lvlText w:val="o"/>
+      <w:lvlJc w:val="left"/>
+      <w:pPr>
+        <w:ind w:left="1440" w:hanging="360"/>
+      </w:pPr>
+      <w:rPr>
+        <w:rFonts w:ascii="Courier New" w:hAnsi="Courier New" w:cs="Courier New" w:hint="default"/>
+      </w:rPr>
+    </w:lvl>
+    <w:lvl w:ilvl="2" w:tplc="04090005" w:tentative="1">
+      <w:start w:val="1"/>
+      <w:numFmt w:val="bullet"/>
+      <w:lvlText w:val=""/>
+      <w:lvlJc w:val="left"/>
+      <w:pPr>
+        <w:ind w:left="2160" w:hanging="360"/>
+      </w:pPr>
+      <w:rPr>
+        <w:rFonts w:ascii="Wingdings" w:hAnsi="Wingdings" w:hint="default"/>
+      </w:rPr>
+    </w:lvl>
+    <w:lvl w:ilvl="3" w:tplc="04090001" w:tentative="1">
+      <w:start w:val="1"/>
+      <w:numFmt w:val="bullet"/>
+      <w:lvlText w:val=""/>
+      <w:lvlJc w:val="left"/>
+      <w:pPr>
+        <w:ind w:left="2880" w:hanging="360"/>
+      </w:pPr>
+      <w:rPr>
+        <w:rFonts w:ascii="Symbol" w:hAnsi="Symbol" w:hint="default"/>
+      </w:rPr>
+    </w:lvl>
+    <w:lvl w:ilvl="4" w:tplc="04090003" w:tentative="1">
+      <w:start w:val="1"/>
+      <w:numFmt w:val="bullet"/>
+      <w:lvlText w:val="o"/>
+      <w:lvlJc w:val="left"/>
+      <w:pPr>
+        <w:ind w:left="3600" w:hanging="360"/>
+      </w:pPr>
+      <w:rPr>
+        <w:rFonts w:ascii="Courier New" w:hAnsi="Courier New" w:cs="Courier New" w:hint="default"/>
+      </w:rPr>
+    </w:lvl>
+    <w:lvl w:ilvl="5" w:tplc="04090005" w:tentative="1">
+      <w:start w:val="1"/>
+      <w:numFmt w:val="bullet"/>
+      <w:lvlText w:val=""/>
+      <w:lvlJc w:val="left"/>
+      <w:pPr>
+        <w:ind w:left="4320" w:hanging="360"/>
+      </w:pPr>
+      <w:rPr>
+        <w:rFonts w:ascii="Wingdings" w:hAnsi="Wingdings" w:hint="default"/>
+      </w:rPr>
+    </w:lvl>
+    <w:lvl w:ilvl="6" w:tplc="04090001" w:tentative="1">
+      <w:start w:val="1"/>
+      <w:numFmt w:val="bullet"/>
+      <w:lvlText w:val=""/>
+      <w:lvlJc w:val="left"/>
+      <w:pPr>
+        <w:ind w:left="5040" w:hanging="360"/>
+      </w:pPr>
+      <w:rPr>
+        <w:rFonts w:ascii="Symbol" w:hAnsi="Symbol" w:hint="default"/>
+      </w:rPr>
+    </w:lvl>
+    <w:lvl w:ilvl="7" w:tplc="04090003" w:tentative="1">
+      <w:start w:val="1"/>
+      <w:numFmt w:val="bullet"/>
+      <w:lvlText w:val="o"/>
+      <w:lvlJc w:val="left"/>
+      <w:pPr>
+        <w:ind w:left="5760" w:hanging="360"/>
+      </w:pPr>
+      <w:rPr>
+        <w:rFonts w:ascii="Courier New" w:hAnsi="Courier New" w:cs="Courier New" w:hint="default"/>
+      </w:rPr>
+    </w:lvl>
+    <w:lvl w:ilvl="8" w:tplc="04090005" w:tentative="1">
+      <w:start w:val="1"/>
+      <w:numFmt w:val="bullet"/>
+      <w:lvlText w:val=""/>
+      <w:lvlJc w:val="left"/>
+      <w:pPr>
+        <w:ind w:left="6480" w:hanging="360"/>
+      </w:pPr>
+      <w:rPr>
+        <w:rFonts w:ascii="Wingdings" w:hAnsi="Wingdings" w:hint="default"/>
+      </w:rPr>
+    </w:lvl>
+  </w:abstractNum>
+  <w:abstractNum w:abstractNumId="11" w15:restartNumberingAfterBreak="0">
     <w:nsid w:val="5E593925"/>
     <w:multiLevelType w:val="multilevel"/>
     <w:tmpl w:val="DEE0E55E"/>
@@ -3111,7 +3302,7 @@
       </w:rPr>
     </w:lvl>
   </w:abstractNum>
-  <w:abstractNum w:abstractNumId="11" w15:restartNumberingAfterBreak="0">
+  <w:abstractNum w:abstractNumId="12" w15:restartNumberingAfterBreak="0">
     <w:nsid w:val="78CD2050"/>
     <w:multiLevelType w:val="multilevel"/>
     <w:tmpl w:val="C28890EC"/>
@@ -3261,10 +3452,10 @@
     </w:lvl>
   </w:abstractNum>
   <w:num w:numId="1" w16cid:durableId="333848089">
-    <w:abstractNumId w:val="11"/>
+    <w:abstractNumId w:val="12"/>
   </w:num>
   <w:num w:numId="2" w16cid:durableId="18900253">
-    <w:abstractNumId w:val="10"/>
+    <w:abstractNumId w:val="11"/>
   </w:num>
   <w:num w:numId="3" w16cid:durableId="1163206545">
     <w:abstractNumId w:val="9"/>
@@ -3295,6 +3486,9 @@
   </w:num>
   <w:num w:numId="12" w16cid:durableId="1568612505">
     <w:abstractNumId w:val="0"/>
+  </w:num>
+  <w:num w:numId="13" w16cid:durableId="853148927">
+    <w:abstractNumId w:val="10"/>
   </w:num>
 </w:numbering>
 </file>

</xml_diff>